<commit_message>
feat: User management updates and template modifications
</commit_message>
<xml_diff>
--- a/backend/output/variant_6961074b3b3496c72e9ea968.docx
+++ b/backend/output/variant_6961074b3b3496c72e9ea968.docx
@@ -58,23 +58,6 @@
         </w:rPr>
         <w:t>Desenvolvedor Full-Stack</w:t>
       </w:r>
-      <w:r>
-        <w:rPr>
-          <w:rFonts w:ascii="Nunito" w:eastAsia="Trebuchet MS" w:hAnsi="Nunito" w:cs="Trebuchet MS"/>
-          <w:b/>
-          <w:bCs/>
-          <w:color w:val="auto"/>
-          <w:sz w:val="24"/>
-          <w:szCs w:val="24"/>
-          <w:bdr w:val="none" w:sz="0" w:space="0" w:color="auto"/>
-          <w:lang w:eastAsia="en-US"/>
-          <w14:textOutline w14:w="0" w14:cap="rnd" w14:cmpd="sng" w14:algn="ctr">
-            <w14:noFill/>
-            <w14:prstDash w14:val="solid"/>
-            <w14:bevel/>
-          </w14:textOutline>
-        </w:rPr>
-      </w:r>
     </w:p>
     <w:p>
       <w:pPr>
@@ -91,18 +74,6 @@
           <w:u w:color="666666"/>
         </w:rPr>
         <w:t>Presidente Prudente – São Paulo</w:t>
-      </w:r>
-      <w:r>
-        <w:rPr>
-          <w:color w:val="auto"/>
-          <w:u w:val="single" w:color="666666"/>
-        </w:rPr>
-      </w:r>
-      <w:r>
-        <w:rPr>
-          <w:color w:val="auto"/>
-          <w:u w:color="666666"/>
-        </w:rPr>
       </w:r>
     </w:p>
     <w:p>
@@ -138,42 +109,6 @@
           <w:lang w:val="it-IT"/>
         </w:rPr>
         <w:t>Telefone: (18) 99745-0885</w:t>
-      </w:r>
-      <w:r>
-        <w:rPr>
-          <w:rFonts w:ascii="Nunito" w:hAnsi="Nunito"/>
-          <w:lang w:val="it-IT"/>
-        </w:rPr>
-      </w:r>
-      <w:r>
-        <w:rPr>
-          <w:rFonts w:ascii="Nunito" w:hAnsi="Nunito"/>
-          <w:lang w:val="it-IT"/>
-        </w:rPr>
-      </w:r>
-      <w:r>
-        <w:rPr>
-          <w:color w:val="auto"/>
-          <w:u w:color="666666"/>
-        </w:rPr>
-      </w:r>
-      <w:r>
-        <w:rPr>
-          <w:color w:val="auto"/>
-          <w:u w:color="666666"/>
-        </w:rPr>
-      </w:r>
-      <w:r>
-        <w:rPr>
-          <w:color w:val="auto"/>
-          <w:u w:color="666666"/>
-        </w:rPr>
-      </w:r>
-      <w:r>
-        <w:rPr>
-          <w:color w:val="auto"/>
-          <w:u w:color="666666"/>
-        </w:rPr>
       </w:r>
     </w:p>
     <w:p>
@@ -542,79 +477,11 @@
         </w:rPr>
         <w:t>Java</w:t>
       </w:r>
-    </w:p>
-    <w:p>
-      <w:pPr>
-        <w:pStyle w:val="Corpodetexto"/>
-        <w:ind w:left="198"/>
+      <w:r>
         <w:rPr>
           <w:rFonts w:ascii="Nunito" w:hAnsi="Nunito"/>
           <w:lang w:val="pt-BR"/>
         </w:rPr>
-      </w:pPr>
-      <w:r>
-        <w:rPr>
-          <w:rFonts w:ascii="Nunito" w:hAnsi="Nunito"/>
-          <w:lang w:val="pt-BR"/>
-        </w:rPr>
-        <w:t>Git</w:t>
-      </w:r>
-    </w:p>
-    <w:p>
-      <w:pPr>
-        <w:pStyle w:val="Corpodetexto"/>
-        <w:ind w:left="198"/>
-        <w:rPr>
-          <w:rFonts w:ascii="Nunito" w:hAnsi="Nunito"/>
-          <w:lang w:val="pt-BR"/>
-        </w:rPr>
-      </w:pPr>
-      <w:r>
-        <w:rPr>
-          <w:rFonts w:ascii="Nunito" w:hAnsi="Nunito"/>
-          <w:lang w:val="pt-BR"/>
-        </w:rPr>
-        <w:t>Microservices</w:t>
-      </w:r>
-    </w:p>
-    <w:p>
-      <w:pPr>
-        <w:pStyle w:val="Corpodetexto"/>
-        <w:ind w:left="198"/>
-        <w:rPr>
-          <w:rFonts w:ascii="Nunito" w:hAnsi="Nunito"/>
-          <w:lang w:val="pt-BR"/>
-        </w:rPr>
-      </w:pPr>
-      <w:r>
-        <w:rPr>
-          <w:rFonts w:ascii="Nunito" w:hAnsi="Nunito"/>
-          <w:lang w:val="pt-BR"/>
-        </w:rPr>
-        <w:t>Unit test</w:t>
-      </w:r>
-    </w:p>
-    <w:p>
-      <w:pPr>
-        <w:pStyle w:val="Corpodetexto"/>
-        <w:ind w:left="198"/>
-        <w:rPr>
-          <w:rFonts w:ascii="Nunito" w:hAnsi="Nunito"/>
-          <w:lang w:val="pt-BR"/>
-        </w:rPr>
-      </w:pPr>
-      <w:r>
-        <w:rPr>
-          <w:rFonts w:ascii="Nunito" w:hAnsi="Nunito"/>
-          <w:lang w:val="pt-BR"/>
-        </w:rPr>
-        <w:t>AWS</w:t>
-      </w:r>
-      <w:r>
-        <w:rPr>
-          <w:rFonts w:ascii="Nunito" w:hAnsi="Nunito"/>
-          <w:lang w:val="pt-BR"/>
-        </w:rPr>
       </w:r>
     </w:p>
     <w:p>
@@ -630,7 +497,7 @@
           <w:rFonts w:ascii="Open Sans ExtraBold" w:hAnsi="Open Sans ExtraBold" w:cs="Open Sans ExtraBold"/>
           <w:spacing w:val="-2"/>
         </w:rPr>
-        <w:t>FORMAÇÃO</w:t>
+        <w:t>Git</w:t>
       </w:r>
     </w:p>
     <w:p>
@@ -649,80 +516,7 @@
           <w:noProof/>
           <w:sz w:val="3"/>
         </w:rPr>
-        <mc:AlternateContent>
-          <mc:Choice Requires="wps">
-            <w:drawing>
-              <wp:anchor distT="0" distB="0" distL="0" distR="0" simplePos="0" relativeHeight="487588864" behindDoc="1" locked="0" layoutInCell="1" allowOverlap="1" wp14:anchorId="1673BAD6" wp14:editId="70D366A7">
-                <wp:simplePos x="0" y="0"/>
-                <wp:positionH relativeFrom="page">
-                  <wp:posOffset>755999</wp:posOffset>
-                </wp:positionH>
-                <wp:positionV relativeFrom="paragraph">
-                  <wp:posOffset>46955</wp:posOffset>
-                </wp:positionV>
-                <wp:extent cx="6048375" cy="1270"/>
-                <wp:effectExtent l="0" t="0" r="0" b="0"/>
-                <wp:wrapTopAndBottom/>
-                <wp:docPr id="14" name="Graphic 14"/>
-                <wp:cNvGraphicFramePr>
-                  <a:graphicFrameLocks xmlns:a="http://schemas.openxmlformats.org/drawingml/2006/main"/>
-                </wp:cNvGraphicFramePr>
-                <a:graphic xmlns:a="http://schemas.openxmlformats.org/drawingml/2006/main">
-                  <a:graphicData uri="http://schemas.microsoft.com/office/word/2010/wordprocessingShape">
-                    <wps:wsp>
-                      <wps:cNvSpPr>
-                        <a:spLocks/>
-                      </wps:cNvSpPr>
-                      <wps:spPr>
-                        <a:xfrm>
-                          <a:off x="0" y="0"/>
-                          <a:ext cx="6048375" cy="1270"/>
-                        </a:xfrm>
-                        <a:custGeom>
-                          <a:avLst/>
-                          <a:gdLst/>
-                          <a:ahLst/>
-                          <a:cxnLst/>
-                          <a:rect l="l" t="t" r="r" b="b"/>
-                          <a:pathLst>
-                            <a:path w="6048375">
-                              <a:moveTo>
-                                <a:pt x="0" y="0"/>
-                              </a:moveTo>
-                              <a:lnTo>
-                                <a:pt x="6047999" y="0"/>
-                              </a:lnTo>
-                            </a:path>
-                          </a:pathLst>
-                        </a:custGeom>
-                        <a:ln w="19049">
-                          <a:solidFill>
-                            <a:srgbClr val="A6A6A6"/>
-                          </a:solidFill>
-                          <a:prstDash val="solid"/>
-                        </a:ln>
-                      </wps:spPr>
-                      <wps:bodyPr wrap="square" lIns="0" tIns="0" rIns="0" bIns="0" rtlCol="0">
-                        <a:prstTxWarp prst="textNoShape">
-                          <a:avLst/>
-                        </a:prstTxWarp>
-                        <a:noAutofit/>
-                      </wps:bodyPr>
-                    </wps:wsp>
-                  </a:graphicData>
-                </a:graphic>
-              </wp:anchor>
-            </w:drawing>
-          </mc:Choice>
-          <mc:Fallback>
-            <w:pict>
-              <v:shape w14:anchorId="24D6BB66" id="Graphic 14" o:spid="_x0000_s1026" style="position:absolute;margin-left:59.55pt;margin-top:3.7pt;width:476.25pt;height:.1pt;z-index:-15727616;visibility:visible;mso-wrap-style:square;mso-wrap-distance-left:0;mso-wrap-distance-top:0;mso-wrap-distance-right:0;mso-wrap-distance-bottom:0;mso-position-horizontal:absolute;mso-position-horizontal-relative:page;mso-position-vertical:absolute;mso-position-vertical-relative:text;v-text-anchor:top" coordsize="6048375,1270" o:gfxdata="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" path="m,l6047999,e" filled="f" strokecolor="#a6a6a6" strokeweight=".52914mm">
-                <v:path arrowok="t"/>
-                <w10:wrap type="topAndBottom" anchorx="page"/>
-              </v:shape>
-            </w:pict>
-          </mc:Fallback>
-        </mc:AlternateContent>
+        <w:t>Microservices</w:t>
       </w:r>
     </w:p>
     <w:p>
@@ -740,34 +534,30 @@
           <w:rFonts w:ascii="Nunito" w:hAnsi="Nunito"/>
           <w:lang w:val="pt-BR"/>
         </w:rPr>
-        <w:t>Sistemas de informação</w:t>
+        <w:t>Unit test</w:t>
       </w:r>
       <w:r>
         <w:rPr>
           <w:rFonts w:ascii="Nunito" w:hAnsi="Nunito"/>
           <w:lang w:val="pt-BR"/>
         </w:rPr>
-        <w:t xml:space="preserve"> –</w:t>
       </w:r>
       <w:r>
         <w:rPr>
           <w:rFonts w:ascii="Nunito" w:hAnsi="Nunito"/>
           <w:lang w:val="pt-BR"/>
         </w:rPr>
-        <w:t xml:space="preserve"> Unoeste</w:t>
       </w:r>
       <w:r>
         <w:rPr>
           <w:rFonts w:ascii="Nunito" w:hAnsi="Nunito"/>
         </w:rPr>
-        <w:br/>
       </w:r>
       <w:r>
         <w:rPr>
           <w:rFonts w:ascii="Nunito" w:hAnsi="Nunito"/>
           <w:lang w:val="pt-BR"/>
         </w:rPr>
-        <w:t>Jan/2022 – Dez 2026</w:t>
       </w:r>
     </w:p>
     <w:p>
@@ -1095,7 +885,7 @@
         <v:path o:extrusionok="f" gradientshapeok="t" o:connecttype="rect"/>
         <o:lock v:ext="edit" aspectratio="t"/>
       </v:shapetype>
-      <v:shape id="_x0000_i1026" type="#_x0000_t75" style="width:7.5pt;height:7.5pt;visibility:visible;mso-wrap-style:square" o:bullet="t">
+      <v:shape id="_x0000_i1028" type="#_x0000_t75" style="width:7.5pt;height:7.5pt;visibility:visible;mso-wrap-style:square" o:bullet="t">
         <v:imagedata r:id="rId1" o:title=""/>
         <o:lock v:ext="edit" aspectratio="f"/>
       </v:shape>

</xml_diff>